<commit_message>
Prepare for GitHub Pages
</commit_message>
<xml_diff>
--- a/link.docx
+++ b/link.docx
@@ -8,59 +8,14 @@
           <w:rPr>
             <w:rStyle w:val="Hyperlink"/>
           </w:rPr>
-          <w:t>https://polokokalane1234.github.i</w:t>
-        </w:r>
-        <w:r>
-          <w:rPr>
-            <w:rStyle w:val="Hyperlink"/>
-          </w:rPr>
-          <w:t>o</w:t>
-        </w:r>
-        <w:r>
-          <w:rPr>
-            <w:rStyle w:val="Hyperlink"/>
-          </w:rPr>
-          <w:t>/KALANE-Co</w:t>
-        </w:r>
-        <w:r>
-          <w:rPr>
-            <w:rStyle w:val="Hyperlink"/>
-          </w:rPr>
-          <w:t>m</w:t>
-        </w:r>
-        <w:r>
-          <w:rPr>
-            <w:rStyle w:val="Hyperlink"/>
-          </w:rPr>
-          <w:t>uni</w:t>
-        </w:r>
-        <w:r>
-          <w:rPr>
-            <w:rStyle w:val="Hyperlink"/>
-          </w:rPr>
-          <w:t>t</w:t>
-        </w:r>
-        <w:r>
-          <w:rPr>
-            <w:rStyle w:val="Hyperlink"/>
-          </w:rPr>
-          <w:t>y-Libr</w:t>
-        </w:r>
-        <w:r>
-          <w:rPr>
-            <w:rStyle w:val="Hyperlink"/>
-          </w:rPr>
-          <w:t>a</w:t>
-        </w:r>
-        <w:r>
-          <w:rPr>
-            <w:rStyle w:val="Hyperlink"/>
-          </w:rPr>
-          <w:t>ry</w:t>
+          <w:t>https://github.com/POLOKOKALANE1234/KALANE-Library.git</w:t>
         </w:r>
       </w:hyperlink>
     </w:p>
-    <w:p/>
+    <w:p>
+      <w:bookmarkStart w:id="0" w:name="_GoBack"/>
+      <w:bookmarkEnd w:id="0"/>
+    </w:p>
     <w:p/>
     <w:p>
       <w:hyperlink r:id="rId5" w:history="1">
@@ -68,47 +23,14 @@
           <w:rPr>
             <w:rStyle w:val="Hyperlink"/>
           </w:rPr>
-          <w:t>http://loca</w:t>
-        </w:r>
-        <w:r>
-          <w:rPr>
-            <w:rStyle w:val="Hyperlink"/>
-          </w:rPr>
-          <w:t>l</w:t>
-        </w:r>
-        <w:r>
-          <w:rPr>
-            <w:rStyle w:val="Hyperlink"/>
-          </w:rPr>
-          <w:t>host</w:t>
-        </w:r>
-        <w:r>
-          <w:rPr>
-            <w:rStyle w:val="Hyperlink"/>
-          </w:rPr>
-          <w:t>:</w:t>
-        </w:r>
-        <w:r>
-          <w:rPr>
-            <w:rStyle w:val="Hyperlink"/>
-          </w:rPr>
-          <w:t>5</w:t>
-        </w:r>
-        <w:r>
-          <w:rPr>
-            <w:rStyle w:val="Hyperlink"/>
-          </w:rPr>
-          <w:t>173</w:t>
+          <w:t>http://localhost:5173</w:t>
         </w:r>
       </w:hyperlink>
     </w:p>
     <w:p/>
     <w:p/>
     <w:p/>
-    <w:p>
-      <w:bookmarkStart w:id="0" w:name="_GoBack"/>
-      <w:bookmarkEnd w:id="0"/>
-    </w:p>
+    <w:p/>
     <w:p/>
     <w:p/>
     <w:sectPr>

</xml_diff>